<commit_message>
feat: complete full-chain stability and security refactor
</commit_message>
<xml_diff>
--- a/规划文档/Hermes语音开发板实现方案-20260811.docx
+++ b/规划文档/Hermes语音开发板实现方案-20260811.docx
@@ -338,11 +338,7 @@
           </w:tcPr>
           <w:p>
             <w:r>
-              <w:t>ASR：本地 sherpa-onnx + SenseVoice（中文，近实时 0.2~0.3s，免费离线）</w:t>
-              <w:br/>
-              <w:t>TTS：Edge-TTS 晓晓（音色自然）主引擎，piper 离线兜底（自动切换）</w:t>
-              <w:br/>
-              <w:t>LLM：DeepSeek 流式；ASR/TTS/LLM 全部可插拔接口，后续可换火山/讯飞云 API</w:t>
+              <w:t>ASR：本地 sherpa-onnx + SenseVoice；TTS：仅 Edge-TTS 晓晓生产引擎；LLM：DeepSeek 流式直连。ASR/TTS/LLM 均保持可插拔接口；当前交付不启用 piper。</w:t>
             </w:r>
           </w:p>
         </w:tc>
@@ -698,7 +694,7 @@
           </w:tcPr>
           <w:p>
             <w:r>
-              <w:t>音频经 WiFi 上传电脑语音桥（opus 压缩）</w:t>
+              <w:t>音频以 16 kHz/16 bit/单声道原始 PCM 分块上传语音桥（不使用 opus）</w:t>
             </w:r>
           </w:p>
         </w:tc>
@@ -934,7 +930,7 @@
           </w:tcPr>
           <w:p>
             <w:r>
-              <w:t>0.05s（opus 更小）</w:t>
+              <w:t>原始 PCM 分块边录边传；局域网开销约 0.05s</w:t>
             </w:r>
           </w:p>
         </w:tc>
@@ -1154,7 +1150,7 @@
         <w:pStyle w:val="ListBullet"/>
       </w:pPr>
       <w:r>
-        <w:t>TTS：Edge-TTS 晓晓主引擎 + piper 离线兜底（已敲定，见第二节第7条）；ASR/TTS 均可平滑迁移服务器（可插拔接口）</w:t>
+        <w:t>TTS：仅使用 Edge-TTS 晓晓生产引擎（已移除未达可用质量的 piper 运行兜底）；ASR/TTS 均通过可插拔接口调用。</w:t>
       </w:r>
     </w:p>
     <w:p>
@@ -1178,7 +1174,7 @@
         <w:pStyle w:val="ListBullet"/>
       </w:pPr>
       <w:r>
-        <w:t>固件：录音 → 静音/按键判定 → opus 编码 → WiFi 上传 → 接收音频 → I2S 播放</w:t>
+        <w:t>固件：按键按下立即预缓冲与录音 → 原始 PCM 分块上传 → 接收长度前缀 WAV 帧 → 校验后分块写入 I2S，首帧到达即播放。</w:t>
       </w:r>
     </w:p>
     <w:p>
@@ -1186,7 +1182,7 @@
         <w:pStyle w:val="ListBullet"/>
       </w:pPr>
       <w:r>
-        <w:t>编译烧录：ESP-IDF v5.2.1 + idf.py（选型依据见 Spec文档/2026-08-11-开发环境验证-spec-v0.1.md §4，最终以环境验证实测为准）</w:t>
+        <w:t>编译烧录：统一使用 ESP-IDF v5.2.7。BOX-3 工作源码位于 D:\esp-box\examples\voice_agent，使用 D:\esp-box\build_voice.py（COM5）；腕带源码位于 D:\esp-box\examples\ble_wrist_node，使用 D:\esp-box\build_wrist.py（COM6）。</w:t>
       </w:r>
     </w:p>
     <w:p>
@@ -1390,6 +1386,78 @@
       </w:pPr>
       <w:r>
         <w:t>协作模式：Hermes 定义交付与验收标准，WorkBuddy 产出代码经 Hermes 审核后合入。</w:t>
+      </w:r>
+    </w:p>
+    <w:p>
+      <w:pPr>
+        <w:pStyle w:val="Heading1"/>
+      </w:pPr>
+      <w:r>
+        <w:t>十、2026-08-30 重构落地状态</w:t>
+      </w:r>
+    </w:p>
+    <w:p>
+      <w:pPr>
+        <w:pStyle w:val="ListBullet"/>
+      </w:pPr>
+      <w:r>
+        <w:t>本地配置与 NVS：WiFi 条目和设备令牌仅保存在 Git 忽略的 D:\esp-box\voice_agent.local.json；build_voice.py 构建后生成独立 NVS 镜像。源码、模板和文档不记录真实值。</w:t>
+      </w:r>
+    </w:p>
+    <w:p>
+      <w:pPr>
+        <w:pStyle w:val="ListBullet"/>
+      </w:pPr>
+      <w:r>
+        <w:t>设备认证：健康上传、告警 poll/ack、语音流均携带 X-Device-Token；服务端最终模式为 required，缺失/错误令牌分别返回 401/403。</w:t>
+      </w:r>
+    </w:p>
+    <w:p>
+      <w:pPr>
+        <w:pStyle w:val="ListBullet"/>
+      </w:pPr>
+      <w:r>
+        <w:t>BOX-3 固件边界：credential_store 负责 NVS，audio_session 负责对话/告警仲裁与预缓冲，wav_stream 负责 WAV 校验和分块播放，ble_central 负责腕带订阅、重连与健康上报。</w:t>
+      </w:r>
+    </w:p>
+    <w:p>
+      <w:pPr>
+        <w:pStyle w:val="ListBullet"/>
+      </w:pPr>
+      <w:r>
+        <w:t>服务端边界：device_auth、audio_input、alert_outbox 分别负责认证、流输入约束与持久化告警；路由层保持薄层，DeepSeek 客户端明确 trust_env=False，微信 iLink 不配置代理。</w:t>
+      </w:r>
+    </w:p>
+    <w:p>
+      <w:pPr>
+        <w:pStyle w:val="ListBullet"/>
+      </w:pPr>
+      <w:r>
+        <w:t>音频协议：BOX-3 以原始 PCM 分块上传，服务端以 4 字节大端长度 + WAV 载荷分帧返回；首帧就绪后立即下发和播放，不等待完整回复。</w:t>
+      </w:r>
+    </w:p>
+    <w:p>
+      <w:pPr>
+        <w:pStyle w:val="ListBullet"/>
+      </w:pPr>
+      <w:r>
+        <w:t>真机结果：COM5/COM6 构建、烧录、WiFi、BLE、按键、语音和告警链路均已验证；腕带与外部血氧仪稳定点差值为血氧 1 个百分点、心率 1 bpm，BLE 观测 lost=0。</w:t>
+      </w:r>
+    </w:p>
+    <w:p>
+      <w:pPr>
+        <w:pStyle w:val="ListBullet"/>
+      </w:pPr>
+      <w:r>
+        <w:t>首字门：固定短语“你好”五轮的松键到 codec 首 PCM 中位数由 1656.169 ms 降至 1484.589 ms，改善 171.580 ms（10.36%），未触发追加 10 轮 P95 门。</w:t>
+      </w:r>
+    </w:p>
+    <w:p>
+      <w:pPr>
+        <w:pStyle w:val="ListBullet"/>
+      </w:pPr>
+      <w:r>
+        <w:t>交付边界：上述结果属于 Codex 开发自测证据，仍需 Hermes 独立审核后方可合入；本轮不提交、不推送、不改写 Git 历史。</w:t>
       </w:r>
     </w:p>
     <w:sectPr>

</xml_diff>